<commit_message>
Update B22DCDT294 - Nguyễn Hoàng Tùng - .docx
</commit_message>
<xml_diff>
--- a/20251/Phân tích thiết kế HTTT/B22DCDT294 - Nguyễn Hoàng Tùng - .docx
+++ b/20251/Phân tích thiết kế HTTT/B22DCDT294 - Nguyễn Hoàng Tùng - .docx
@@ -1770,7 +1770,19 @@
         <w:rPr>
           <w:rFonts w:cs="Times New Roman"/>
         </w:rPr>
-        <w:t xml:space="preserve"> hệ thống hiển thị giao diện quản lý hiển thị với:</w:t>
+        <w:t xml:space="preserve"> giao diện quản lý </w:t>
+      </w:r>
+      <w:r>
+        <w:rPr>
+          <w:rFonts w:cs="Times New Roman"/>
+        </w:rPr>
+        <w:t xml:space="preserve">hệ thống </w:t>
+      </w:r>
+      <w:r>
+        <w:rPr>
+          <w:rFonts w:cs="Times New Roman"/>
+        </w:rPr>
+        <w:t>hiển thị với</w:t>
       </w:r>
     </w:p>
     <w:p>
@@ -1793,7 +1805,13 @@
         <w:rPr>
           <w:rFonts w:cs="Times New Roman"/>
         </w:rPr>
-        <w:t>Thông tin của quản lý: tên đăng nhập, họ tên, vai trò…</w:t>
+        <w:t>t</w:t>
+      </w:r>
+      <w:r>
+        <w:rPr>
+          <w:rFonts w:cs="Times New Roman"/>
+        </w:rPr>
+        <w:t>hông tin của quản lý: tên đăng nhập, họ tên, vai trò…</w:t>
       </w:r>
     </w:p>
     <w:p>
@@ -1816,7 +1834,13 @@
         <w:rPr>
           <w:rFonts w:cs="Times New Roman"/>
         </w:rPr>
-        <w:t>Trình đơn cho phép chọn các chức năng: quản lý thông tin nhà cung cấp trang phục, nhập trang phục từ nhà cung cấp, xem thống kê nhà cung cấp theo doanh chi.</w:t>
+        <w:t>t</w:t>
+      </w:r>
+      <w:r>
+        <w:rPr>
+          <w:rFonts w:cs="Times New Roman"/>
+        </w:rPr>
+        <w:t>rình đơn cho phép chọn các chức năng: quản lý thông tin nhà cung cấp trang phục, nhập trang phục từ nhà cung cấp, xem thống kê nhà cung cấp theo doanh chi.</w:t>
       </w:r>
     </w:p>
     <w:p>
@@ -1886,7 +1910,19 @@
         <w:rPr>
           <w:rFonts w:cs="Times New Roman"/>
         </w:rPr>
-        <w:t xml:space="preserve"> hệ thống hiển thị lại giao diện đăng nhập.</w:t>
+        <w:t xml:space="preserve"> giao diện đăng nhập</w:t>
+      </w:r>
+      <w:r>
+        <w:rPr>
+          <w:rFonts w:cs="Times New Roman"/>
+        </w:rPr>
+        <w:t xml:space="preserve"> được hiển thị lại</w:t>
+      </w:r>
+      <w:r>
+        <w:rPr>
+          <w:rFonts w:cs="Times New Roman"/>
+        </w:rPr>
+        <w:t>.</w:t>
       </w:r>
     </w:p>
     <w:p>
@@ -1919,7 +1955,7 @@
         <w:rPr>
           <w:rFonts w:cs="Times New Roman"/>
         </w:rPr>
-        <w:t xml:space="preserve"> giao diện quản lý nhà cung cấp trang phục hiển thị với:</w:t>
+        <w:t xml:space="preserve"> giao diện quản lý nhà cung cấp trang phục hiển thị với</w:t>
       </w:r>
     </w:p>
     <w:p>
@@ -1941,7 +1977,25 @@
           <w:rFonts w:cs="Times New Roman"/>
         </w:rPr>
         <w:lastRenderedPageBreak/>
-        <w:t>Một bảng/danh sách gồm các dòng/hàng, mỗi dòng/hàng tương ứng với thông tin của một nhà cung cấp: tên nhà cung cấp, địa chỉ, số điện thoại, email…</w:t>
+        <w:t xml:space="preserve">Một </w:t>
+      </w:r>
+      <w:r>
+        <w:rPr>
+          <w:rFonts w:cs="Times New Roman"/>
+        </w:rPr>
+        <w:t>bảng/danh sác</w:t>
+      </w:r>
+      <w:r>
+        <w:rPr>
+          <w:rFonts w:cs="Times New Roman"/>
+        </w:rPr>
+        <w:t>h</w:t>
+      </w:r>
+      <w:r>
+        <w:rPr>
+          <w:rFonts w:cs="Times New Roman"/>
+        </w:rPr>
+        <w:t>, mỗi dòng/hàng tương ứng với thông tin của một nhà cung cấp: tên nhà cung cấp, địa chỉ, số điện thoại, email…</w:t>
       </w:r>
     </w:p>
     <w:p>
@@ -1962,7 +2016,13 @@
         <w:rPr>
           <w:rFonts w:cs="Times New Roman"/>
         </w:rPr>
-        <w:t>Một trường văn bản để nhập từ khóa + một nút tìm kiếm.</w:t>
+        <w:t>m</w:t>
+      </w:r>
+      <w:r>
+        <w:rPr>
+          <w:rFonts w:cs="Times New Roman"/>
+        </w:rPr>
+        <w:t>ột trường văn bản để nhập từ khóa + một nút tìm kiếm.</w:t>
       </w:r>
     </w:p>
     <w:p>
@@ -1983,7 +2043,64 @@
         <w:rPr>
           <w:rFonts w:cs="Times New Roman"/>
         </w:rPr>
-        <w:t>Một nút thêm nhà cung cấp, một nút chỉnh sửa nhà cung cấp hiện có, một nút xóa nhà cung cấp hiện có.</w:t>
+        <w:t>m</w:t>
+      </w:r>
+      <w:r>
+        <w:rPr>
+          <w:rFonts w:cs="Times New Roman"/>
+        </w:rPr>
+        <w:t>ột nút thêm</w:t>
+      </w:r>
+      <w:r>
+        <w:rPr>
+          <w:rFonts w:cs="Times New Roman"/>
+        </w:rPr>
+        <w:t xml:space="preserve"> mới</w:t>
+      </w:r>
+      <w:r>
+        <w:rPr>
+          <w:rFonts w:cs="Times New Roman"/>
+        </w:rPr>
+        <w:t xml:space="preserve"> nhà cung cấp.</w:t>
+      </w:r>
+    </w:p>
+    <w:p>
+      <w:pPr>
+        <w:pStyle w:val="ListParagraph"/>
+        <w:numPr>
+          <w:ilvl w:val="1"/>
+          <w:numId w:val="7"/>
+        </w:numPr>
+        <w:autoSpaceDE/>
+        <w:autoSpaceDN/>
+        <w:spacing w:after="160"/>
+        <w:rPr>
+          <w:rFonts w:cs="Times New Roman"/>
+        </w:rPr>
+      </w:pPr>
+      <w:r>
+        <w:rPr>
+          <w:rFonts w:cs="Times New Roman"/>
+        </w:rPr>
+        <w:t xml:space="preserve">Quản lý chọn một hàng/dòng trong bảng/danh sách </w:t>
+      </w:r>
+      <w:r>
+        <w:rPr>
+          <w:rFonts w:cs="Times New Roman"/>
+        </w:rPr>
+        <w:sym w:font="Wingdings" w:char="F0E0"/>
+      </w:r>
+      <w:r>
+        <w:rPr>
+          <w:rFonts w:cs="Times New Roman"/>
+        </w:rPr>
+        <w:t xml:space="preserve"> giao diện thông tin</w:t>
+      </w:r>
+      <w:r>
+        <w:rPr>
+          <w:rFonts w:cs="Times New Roman"/>
+        </w:rPr>
+        <w:t xml:space="preserve"> chi tiết nhà cung cấp hiển thị với</w:t>
       </w:r>
     </w:p>
     <w:p>
@@ -2000,6 +2117,1298 @@
           <w:rFonts w:cs="Times New Roman"/>
         </w:rPr>
       </w:pPr>
+      <w:r>
+        <w:rPr>
+          <w:rFonts w:cs="Times New Roman"/>
+        </w:rPr>
+        <w:t>thông tin của nhà cung cấp đã chọn: tên nhà cung cấp, địa chỉ, số điện thoại, email…</w:t>
+      </w:r>
+    </w:p>
+    <w:p>
+      <w:pPr>
+        <w:pStyle w:val="ListParagraph"/>
+        <w:numPr>
+          <w:ilvl w:val="2"/>
+          <w:numId w:val="7"/>
+        </w:numPr>
+        <w:autoSpaceDE/>
+        <w:autoSpaceDN/>
+        <w:spacing w:after="160"/>
+        <w:rPr>
+          <w:rFonts w:cs="Times New Roman"/>
+        </w:rPr>
+      </w:pPr>
+      <w:r>
+        <w:rPr>
+          <w:rFonts w:cs="Times New Roman"/>
+        </w:rPr>
+        <w:t>một nút chỉnh sửa thông tin nhà cung cấp, một nút xóa nhà cung cấp.</w:t>
+      </w:r>
+    </w:p>
+    <w:p>
+      <w:pPr>
+        <w:pStyle w:val="ListParagraph"/>
+        <w:numPr>
+          <w:ilvl w:val="1"/>
+          <w:numId w:val="7"/>
+        </w:numPr>
+        <w:autoSpaceDE/>
+        <w:autoSpaceDN/>
+        <w:spacing w:after="160"/>
+        <w:rPr>
+          <w:rFonts w:cs="Times New Roman"/>
+        </w:rPr>
+      </w:pPr>
+      <w:r>
+        <w:rPr>
+          <w:rFonts w:cs="Times New Roman"/>
+        </w:rPr>
+        <w:t xml:space="preserve">Quản lý chọn chỉnh sửa thông tin nhà cung cấp </w:t>
+      </w:r>
+      <w:r>
+        <w:rPr>
+          <w:rFonts w:cs="Times New Roman"/>
+        </w:rPr>
+        <w:sym w:font="Wingdings" w:char="F0E0"/>
+      </w:r>
+      <w:r>
+        <w:rPr>
+          <w:rFonts w:cs="Times New Roman"/>
+        </w:rPr>
+        <w:t xml:space="preserve"> giao diện chỉnh sửa thông tin nhà cung cấp hiển thị với</w:t>
+      </w:r>
+    </w:p>
+    <w:p>
+      <w:pPr>
+        <w:pStyle w:val="ListParagraph"/>
+        <w:numPr>
+          <w:ilvl w:val="2"/>
+          <w:numId w:val="7"/>
+        </w:numPr>
+        <w:autoSpaceDE/>
+        <w:autoSpaceDN/>
+        <w:spacing w:after="160"/>
+        <w:rPr>
+          <w:rFonts w:cs="Times New Roman"/>
+        </w:rPr>
+      </w:pPr>
+      <w:r>
+        <w:rPr>
+          <w:rFonts w:cs="Times New Roman"/>
+        </w:rPr>
+        <w:t>một biểu mẫu gồm các trường văn bản điền sẵn thông tin của nhà cung cấp đã chọn.</w:t>
+      </w:r>
+    </w:p>
+    <w:p>
+      <w:pPr>
+        <w:pStyle w:val="ListParagraph"/>
+        <w:numPr>
+          <w:ilvl w:val="2"/>
+          <w:numId w:val="7"/>
+        </w:numPr>
+        <w:autoSpaceDE/>
+        <w:autoSpaceDN/>
+        <w:spacing w:after="160"/>
+        <w:rPr>
+          <w:rFonts w:cs="Times New Roman"/>
+        </w:rPr>
+      </w:pPr>
+      <w:r>
+        <w:rPr>
+          <w:rFonts w:cs="Times New Roman"/>
+        </w:rPr>
+        <w:t>một nút lưu.</w:t>
+      </w:r>
+    </w:p>
+    <w:p>
+      <w:pPr>
+        <w:pStyle w:val="ListParagraph"/>
+        <w:numPr>
+          <w:ilvl w:val="1"/>
+          <w:numId w:val="7"/>
+        </w:numPr>
+        <w:autoSpaceDE/>
+        <w:autoSpaceDN/>
+        <w:spacing w:after="160"/>
+        <w:rPr>
+          <w:rFonts w:cs="Times New Roman"/>
+        </w:rPr>
+      </w:pPr>
+      <w:r>
+        <w:rPr>
+          <w:rFonts w:cs="Times New Roman"/>
+        </w:rPr>
+        <w:t xml:space="preserve">Quản lý chỉnh sửa thông tin trong các trường và nhấn nút lưu </w:t>
+      </w:r>
+      <w:r>
+        <w:rPr>
+          <w:rFonts w:cs="Times New Roman"/>
+        </w:rPr>
+        <w:sym w:font="Wingdings" w:char="F0E0"/>
+      </w:r>
+      <w:r>
+        <w:rPr>
+          <w:rFonts w:cs="Times New Roman"/>
+        </w:rPr>
+        <w:t xml:space="preserve"> hệ thống hiển thị thông báo chỉnh sửa thành công và nút OK.</w:t>
+      </w:r>
+    </w:p>
+    <w:p>
+      <w:pPr>
+        <w:pStyle w:val="ListParagraph"/>
+        <w:numPr>
+          <w:ilvl w:val="1"/>
+          <w:numId w:val="7"/>
+        </w:numPr>
+        <w:autoSpaceDE/>
+        <w:autoSpaceDN/>
+        <w:spacing w:after="160"/>
+        <w:rPr>
+          <w:rFonts w:cs="Times New Roman"/>
+        </w:rPr>
+      </w:pPr>
+      <w:r>
+        <w:rPr>
+          <w:rFonts w:cs="Times New Roman"/>
+        </w:rPr>
+        <w:t xml:space="preserve">Quản lý nhấn OK </w:t>
+      </w:r>
+      <w:r>
+        <w:rPr>
+          <w:rFonts w:cs="Times New Roman"/>
+        </w:rPr>
+        <w:sym w:font="Wingdings" w:char="F0E0"/>
+      </w:r>
+      <w:r>
+        <w:rPr>
+          <w:rFonts w:cs="Times New Roman"/>
+        </w:rPr>
+        <w:t xml:space="preserve"> giao diện quản lý thông tin nhà cung cấp được hiển thị lại.</w:t>
+      </w:r>
+    </w:p>
+    <w:p>
+      <w:pPr>
+        <w:pStyle w:val="ListParagraph"/>
+        <w:numPr>
+          <w:ilvl w:val="0"/>
+          <w:numId w:val="7"/>
+        </w:numPr>
+        <w:autoSpaceDE/>
+        <w:autoSpaceDN/>
+        <w:spacing w:after="160"/>
+        <w:rPr>
+          <w:rFonts w:cs="Times New Roman"/>
+        </w:rPr>
+      </w:pPr>
+      <w:r>
+        <w:rPr>
+          <w:rFonts w:cs="Times New Roman"/>
+          <w:b/>
+          <w:bCs/>
+        </w:rPr>
+        <w:t>Nhập trang phục về từ nhà cung cấp</w:t>
+      </w:r>
+    </w:p>
+    <w:p>
+      <w:pPr>
+        <w:pStyle w:val="ListParagraph"/>
+        <w:numPr>
+          <w:ilvl w:val="1"/>
+          <w:numId w:val="7"/>
+        </w:numPr>
+        <w:autoSpaceDE/>
+        <w:autoSpaceDN/>
+        <w:spacing w:after="160"/>
+        <w:rPr>
+          <w:rFonts w:cs="Times New Roman"/>
+        </w:rPr>
+      </w:pPr>
+      <w:r>
+        <w:rPr>
+          <w:rFonts w:cs="Times New Roman"/>
+        </w:rPr>
+        <w:t xml:space="preserve">Một nhân viên truy cập vào trang web </w:t>
+      </w:r>
+      <w:r>
+        <w:rPr>
+          <w:rFonts w:cs="Times New Roman"/>
+        </w:rPr>
+        <w:sym w:font="Wingdings" w:char="F0E0"/>
+      </w:r>
+      <w:r>
+        <w:rPr>
+          <w:rFonts w:cs="Times New Roman"/>
+        </w:rPr>
+        <w:t xml:space="preserve"> giao diện quản lý</w:t>
+      </w:r>
+      <w:r>
+        <w:rPr>
+          <w:rFonts w:cs="Times New Roman"/>
+        </w:rPr>
+        <w:t xml:space="preserve"> hệ thống</w:t>
+      </w:r>
+      <w:r>
+        <w:rPr>
+          <w:rFonts w:cs="Times New Roman"/>
+        </w:rPr>
+        <w:t xml:space="preserve"> hiển thị với</w:t>
+      </w:r>
+    </w:p>
+    <w:p>
+      <w:pPr>
+        <w:pStyle w:val="ListParagraph"/>
+        <w:numPr>
+          <w:ilvl w:val="2"/>
+          <w:numId w:val="7"/>
+        </w:numPr>
+        <w:autoSpaceDE/>
+        <w:autoSpaceDN/>
+        <w:spacing w:after="160"/>
+        <w:rPr>
+          <w:rFonts w:cs="Times New Roman"/>
+        </w:rPr>
+      </w:pPr>
+      <w:r>
+        <w:rPr>
+          <w:rFonts w:cs="Times New Roman"/>
+        </w:rPr>
+        <w:t>t</w:t>
+      </w:r>
+      <w:r>
+        <w:rPr>
+          <w:rFonts w:cs="Times New Roman"/>
+        </w:rPr>
+        <w:t>hông tin của nhân viên: tên đăng nhập, họ tên, vai trò…</w:t>
+      </w:r>
+    </w:p>
+    <w:p>
+      <w:pPr>
+        <w:pStyle w:val="ListParagraph"/>
+        <w:numPr>
+          <w:ilvl w:val="2"/>
+          <w:numId w:val="7"/>
+        </w:numPr>
+        <w:autoSpaceDE/>
+        <w:autoSpaceDN/>
+        <w:spacing w:after="160"/>
+        <w:rPr>
+          <w:rFonts w:cs="Times New Roman"/>
+        </w:rPr>
+      </w:pPr>
+      <w:r>
+        <w:rPr>
+          <w:rFonts w:cs="Times New Roman"/>
+        </w:rPr>
+        <w:lastRenderedPageBreak/>
+        <w:t>t</w:t>
+      </w:r>
+      <w:r>
+        <w:rPr>
+          <w:rFonts w:cs="Times New Roman"/>
+        </w:rPr>
+        <w:t>rình đơn cho phép chọn các chức năng: quản lý thông tin nhà cung cấp trang phục, nhập trang phục từ nhà cung cấp, xem thống kê nhà cung cấp theo doanh chi.</w:t>
+      </w:r>
+    </w:p>
+    <w:p>
+      <w:pPr>
+        <w:pStyle w:val="ListParagraph"/>
+        <w:numPr>
+          <w:ilvl w:val="1"/>
+          <w:numId w:val="7"/>
+        </w:numPr>
+        <w:autoSpaceDE/>
+        <w:autoSpaceDN/>
+        <w:spacing w:after="160"/>
+        <w:rPr>
+          <w:rFonts w:cs="Times New Roman"/>
+        </w:rPr>
+      </w:pPr>
+      <w:r>
+        <w:rPr>
+          <w:rFonts w:cs="Times New Roman"/>
+        </w:rPr>
+        <w:t xml:space="preserve">Nhân viên chọn chức năng nhập trang phục từ nhà cung cấp </w:t>
+      </w:r>
+      <w:r>
+        <w:rPr>
+          <w:rFonts w:cs="Times New Roman"/>
+        </w:rPr>
+        <w:sym w:font="Wingdings" w:char="F0E0"/>
+      </w:r>
+      <w:r>
+        <w:rPr>
+          <w:rFonts w:cs="Times New Roman"/>
+        </w:rPr>
+        <w:t xml:space="preserve"> giao diện </w:t>
+      </w:r>
+      <w:r>
+        <w:rPr>
+          <w:rFonts w:cs="Times New Roman"/>
+        </w:rPr>
+        <w:t xml:space="preserve">nhập </w:t>
+      </w:r>
+      <w:r>
+        <w:rPr>
+          <w:rFonts w:cs="Times New Roman"/>
+        </w:rPr>
+        <w:t>trang</w:t>
+      </w:r>
+      <w:r>
+        <w:rPr>
+          <w:rFonts w:cs="Times New Roman"/>
+        </w:rPr>
+        <w:t xml:space="preserve"> phục với</w:t>
+      </w:r>
+    </w:p>
+    <w:p>
+      <w:pPr>
+        <w:pStyle w:val="ListParagraph"/>
+        <w:numPr>
+          <w:ilvl w:val="2"/>
+          <w:numId w:val="7"/>
+        </w:numPr>
+        <w:autoSpaceDE/>
+        <w:autoSpaceDN/>
+        <w:spacing w:after="160"/>
+        <w:rPr>
+          <w:rFonts w:cs="Times New Roman"/>
+        </w:rPr>
+      </w:pPr>
+      <w:r>
+        <w:rPr>
+          <w:rFonts w:cs="Times New Roman"/>
+        </w:rPr>
+        <w:t xml:space="preserve">một bảng/danh sách với mỗi dòng/hàng là thông tin của một phiếu nhập hàng: mã phiếu nhập, ngày tạo phiếu, </w:t>
+      </w:r>
+      <w:r>
+        <w:rPr>
+          <w:rFonts w:cs="Times New Roman"/>
+        </w:rPr>
+        <w:t xml:space="preserve">người tạo, </w:t>
+      </w:r>
+      <w:r>
+        <w:rPr>
+          <w:rFonts w:cs="Times New Roman"/>
+        </w:rPr>
+        <w:t>tên mặt hàng, tên nhà cung cấp, đơn giá, số lượng, thành tiền.</w:t>
+      </w:r>
+    </w:p>
+    <w:p>
+      <w:pPr>
+        <w:pStyle w:val="ListParagraph"/>
+        <w:numPr>
+          <w:ilvl w:val="2"/>
+          <w:numId w:val="7"/>
+        </w:numPr>
+        <w:autoSpaceDE/>
+        <w:autoSpaceDN/>
+        <w:spacing w:after="160"/>
+        <w:rPr>
+          <w:rFonts w:cs="Times New Roman"/>
+        </w:rPr>
+      </w:pPr>
+      <w:r>
+        <w:rPr>
+          <w:rFonts w:cs="Times New Roman"/>
+        </w:rPr>
+        <w:t>một nút thêm phiếu nhập mới.</w:t>
+      </w:r>
+    </w:p>
+    <w:p>
+      <w:pPr>
+        <w:pStyle w:val="ListParagraph"/>
+        <w:numPr>
+          <w:ilvl w:val="1"/>
+          <w:numId w:val="7"/>
+        </w:numPr>
+        <w:autoSpaceDE/>
+        <w:autoSpaceDN/>
+        <w:spacing w:after="160"/>
+        <w:rPr>
+          <w:rFonts w:cs="Times New Roman"/>
+        </w:rPr>
+      </w:pPr>
+      <w:r>
+        <w:rPr>
+          <w:rFonts w:cs="Times New Roman"/>
+        </w:rPr>
+        <w:t xml:space="preserve">Nhân viên chọn thêm phiếu nhập mới </w:t>
+      </w:r>
+      <w:r>
+        <w:rPr>
+          <w:rFonts w:cs="Times New Roman"/>
+        </w:rPr>
+        <w:sym w:font="Wingdings" w:char="F0E0"/>
+      </w:r>
+      <w:r>
+        <w:rPr>
+          <w:rFonts w:cs="Times New Roman"/>
+        </w:rPr>
+        <w:t xml:space="preserve"> giao diện phiếu nhập trang phục mới hiển thị với</w:t>
+      </w:r>
+    </w:p>
+    <w:p>
+      <w:pPr>
+        <w:pStyle w:val="ListParagraph"/>
+        <w:numPr>
+          <w:ilvl w:val="2"/>
+          <w:numId w:val="7"/>
+        </w:numPr>
+        <w:autoSpaceDE/>
+        <w:autoSpaceDN/>
+        <w:spacing w:after="160"/>
+        <w:rPr>
+          <w:rFonts w:cs="Times New Roman"/>
+        </w:rPr>
+      </w:pPr>
+      <w:r>
+        <w:rPr>
+          <w:rFonts w:cs="Times New Roman"/>
+        </w:rPr>
+        <w:t>một danh sách xổ xuống, mỗi dòng tương ứng với tên của một nhà cung cấp.</w:t>
+      </w:r>
+    </w:p>
+    <w:p>
+      <w:pPr>
+        <w:pStyle w:val="ListParagraph"/>
+        <w:numPr>
+          <w:ilvl w:val="2"/>
+          <w:numId w:val="7"/>
+        </w:numPr>
+        <w:autoSpaceDE/>
+        <w:autoSpaceDN/>
+        <w:spacing w:after="160"/>
+        <w:rPr>
+          <w:rFonts w:cs="Times New Roman"/>
+        </w:rPr>
+      </w:pPr>
+      <w:r>
+        <w:rPr>
+          <w:rFonts w:cs="Times New Roman"/>
+        </w:rPr>
+        <w:t xml:space="preserve">một danh sách xổ xuống, mỗi dòng tương ứng với </w:t>
+      </w:r>
+      <w:r>
+        <w:rPr>
+          <w:rFonts w:cs="Times New Roman"/>
+        </w:rPr>
+        <w:t>thông</w:t>
+      </w:r>
+      <w:r>
+        <w:rPr>
+          <w:rFonts w:cs="Times New Roman"/>
+        </w:rPr>
+        <w:t xml:space="preserve"> của một loại mặt hàng trang phục</w:t>
+      </w:r>
+      <w:r>
+        <w:rPr>
+          <w:rFonts w:cs="Times New Roman"/>
+        </w:rPr>
+        <w:t>: tên, kích cỡ, màu sắc, giá nhập</w:t>
+      </w:r>
+      <w:r>
+        <w:rPr>
+          <w:rFonts w:cs="Times New Roman"/>
+        </w:rPr>
+        <w:t>.</w:t>
+      </w:r>
+    </w:p>
+    <w:p>
+      <w:pPr>
+        <w:pStyle w:val="ListParagraph"/>
+        <w:numPr>
+          <w:ilvl w:val="2"/>
+          <w:numId w:val="7"/>
+        </w:numPr>
+        <w:autoSpaceDE/>
+        <w:autoSpaceDN/>
+        <w:spacing w:after="160"/>
+        <w:rPr>
+          <w:rFonts w:cs="Times New Roman"/>
+        </w:rPr>
+      </w:pPr>
+      <w:r>
+        <w:rPr>
+          <w:rFonts w:cs="Times New Roman"/>
+        </w:rPr>
+        <w:t>một trường điền số lượng.</w:t>
+      </w:r>
+    </w:p>
+    <w:p>
+      <w:pPr>
+        <w:pStyle w:val="ListParagraph"/>
+        <w:numPr>
+          <w:ilvl w:val="2"/>
+          <w:numId w:val="7"/>
+        </w:numPr>
+        <w:autoSpaceDE/>
+        <w:autoSpaceDN/>
+        <w:spacing w:after="160"/>
+        <w:rPr>
+          <w:rFonts w:cs="Times New Roman"/>
+        </w:rPr>
+      </w:pPr>
+      <w:r>
+        <w:rPr>
+          <w:rFonts w:cs="Times New Roman"/>
+        </w:rPr>
+        <w:t>một dòng hiển thị loại mặt hàng đang muốn nhập, đơn giá, số lượng và thành tiền.</w:t>
+      </w:r>
+    </w:p>
+    <w:p>
+      <w:pPr>
+        <w:pStyle w:val="ListParagraph"/>
+        <w:numPr>
+          <w:ilvl w:val="2"/>
+          <w:numId w:val="7"/>
+        </w:numPr>
+        <w:autoSpaceDE/>
+        <w:autoSpaceDN/>
+        <w:spacing w:after="160"/>
+        <w:rPr>
+          <w:rFonts w:cs="Times New Roman"/>
+        </w:rPr>
+      </w:pPr>
+      <w:r>
+        <w:rPr>
+          <w:rFonts w:cs="Times New Roman"/>
+        </w:rPr>
+        <w:t>một trường ghi chú.</w:t>
+      </w:r>
+    </w:p>
+    <w:p>
+      <w:pPr>
+        <w:pStyle w:val="ListParagraph"/>
+        <w:numPr>
+          <w:ilvl w:val="2"/>
+          <w:numId w:val="7"/>
+        </w:numPr>
+        <w:autoSpaceDE/>
+        <w:autoSpaceDN/>
+        <w:spacing w:after="160"/>
+        <w:rPr>
+          <w:rFonts w:cs="Times New Roman"/>
+        </w:rPr>
+      </w:pPr>
+      <w:r>
+        <w:rPr>
+          <w:rFonts w:cs="Times New Roman"/>
+        </w:rPr>
+        <w:t>một nút lưu phiếu nhập.</w:t>
+      </w:r>
+    </w:p>
+    <w:p>
+      <w:pPr>
+        <w:pStyle w:val="ListParagraph"/>
+        <w:numPr>
+          <w:ilvl w:val="1"/>
+          <w:numId w:val="7"/>
+        </w:numPr>
+        <w:autoSpaceDE/>
+        <w:autoSpaceDN/>
+        <w:spacing w:after="160"/>
+        <w:rPr>
+          <w:rFonts w:cs="Times New Roman"/>
+        </w:rPr>
+      </w:pPr>
+      <w:r>
+        <w:rPr>
+          <w:rFonts w:cs="Times New Roman"/>
+        </w:rPr>
+        <w:t xml:space="preserve">Nhân viên chọn nhà cung cấp từ danh sách, chọn loại mặt hàng trang phục muốn nhập từ danh sách, điền số lượng và nhấn lưu </w:t>
+      </w:r>
+      <w:r>
+        <w:rPr>
+          <w:rFonts w:cs="Times New Roman"/>
+        </w:rPr>
+        <w:sym w:font="Wingdings" w:char="F0E0"/>
+      </w:r>
+      <w:r>
+        <w:rPr>
+          <w:rFonts w:cs="Times New Roman"/>
+        </w:rPr>
+        <w:t xml:space="preserve"> hệ thống hiển thị thông báo lưu phiếu nhập thành công và nút OK.</w:t>
+      </w:r>
+    </w:p>
+    <w:p>
+      <w:pPr>
+        <w:pStyle w:val="ListParagraph"/>
+        <w:numPr>
+          <w:ilvl w:val="1"/>
+          <w:numId w:val="7"/>
+        </w:numPr>
+        <w:autoSpaceDE/>
+        <w:autoSpaceDN/>
+        <w:spacing w:after="160"/>
+        <w:rPr>
+          <w:rFonts w:cs="Times New Roman"/>
+        </w:rPr>
+      </w:pPr>
+      <w:r>
+        <w:rPr>
+          <w:rFonts w:cs="Times New Roman"/>
+        </w:rPr>
+        <w:t xml:space="preserve">Nhân viên nhấn nút OK </w:t>
+      </w:r>
+      <w:r>
+        <w:rPr>
+          <w:rFonts w:cs="Times New Roman"/>
+        </w:rPr>
+        <w:sym w:font="Wingdings" w:char="F0E0"/>
+      </w:r>
+      <w:r>
+        <w:rPr>
+          <w:rFonts w:cs="Times New Roman"/>
+        </w:rPr>
+        <w:t xml:space="preserve"> giao diện nhập trang phục được hiển thị lại.</w:t>
+      </w:r>
+    </w:p>
+    <w:p>
+      <w:pPr>
+        <w:pStyle w:val="ListParagraph"/>
+        <w:numPr>
+          <w:ilvl w:val="0"/>
+          <w:numId w:val="7"/>
+        </w:numPr>
+        <w:autoSpaceDE/>
+        <w:autoSpaceDN/>
+        <w:spacing w:after="160"/>
+        <w:rPr>
+          <w:rFonts w:cs="Times New Roman"/>
+        </w:rPr>
+      </w:pPr>
+      <w:r>
+        <w:rPr>
+          <w:rFonts w:cs="Times New Roman"/>
+          <w:b/>
+          <w:bCs/>
+        </w:rPr>
+        <w:lastRenderedPageBreak/>
+        <w:t>Xem thống kê nhà cung cấp theo doanh chi</w:t>
+      </w:r>
+    </w:p>
+    <w:p>
+      <w:pPr>
+        <w:pStyle w:val="ListParagraph"/>
+        <w:numPr>
+          <w:ilvl w:val="1"/>
+          <w:numId w:val="7"/>
+        </w:numPr>
+        <w:autoSpaceDE/>
+        <w:autoSpaceDN/>
+        <w:spacing w:after="160"/>
+        <w:rPr>
+          <w:rFonts w:cs="Times New Roman"/>
+        </w:rPr>
+      </w:pPr>
+      <w:r>
+        <w:rPr>
+          <w:rFonts w:cs="Times New Roman"/>
+        </w:rPr>
+        <w:t xml:space="preserve">Một </w:t>
+      </w:r>
+      <w:r>
+        <w:rPr>
+          <w:rFonts w:cs="Times New Roman"/>
+        </w:rPr>
+        <w:t>quản lý</w:t>
+      </w:r>
+      <w:r>
+        <w:rPr>
+          <w:rFonts w:cs="Times New Roman"/>
+        </w:rPr>
+        <w:t xml:space="preserve"> truy cập vào trang web </w:t>
+      </w:r>
+      <w:r>
+        <w:rPr>
+          <w:rFonts w:cs="Times New Roman"/>
+        </w:rPr>
+        <w:sym w:font="Wingdings" w:char="F0E0"/>
+      </w:r>
+      <w:r>
+        <w:rPr>
+          <w:rFonts w:cs="Times New Roman"/>
+        </w:rPr>
+        <w:t xml:space="preserve"> giao diện quản lý hệ thống hiển thị với</w:t>
+      </w:r>
+    </w:p>
+    <w:p>
+      <w:pPr>
+        <w:pStyle w:val="ListParagraph"/>
+        <w:numPr>
+          <w:ilvl w:val="2"/>
+          <w:numId w:val="7"/>
+        </w:numPr>
+        <w:autoSpaceDE/>
+        <w:autoSpaceDN/>
+        <w:spacing w:after="160"/>
+        <w:rPr>
+          <w:rFonts w:cs="Times New Roman"/>
+        </w:rPr>
+      </w:pPr>
+      <w:r>
+        <w:rPr>
+          <w:rFonts w:cs="Times New Roman"/>
+        </w:rPr>
+        <w:t>t</w:t>
+      </w:r>
+      <w:r>
+        <w:rPr>
+          <w:rFonts w:cs="Times New Roman"/>
+        </w:rPr>
+        <w:t xml:space="preserve">hông tin của </w:t>
+      </w:r>
+      <w:r>
+        <w:rPr>
+          <w:rFonts w:cs="Times New Roman"/>
+        </w:rPr>
+        <w:t>quản lý</w:t>
+      </w:r>
+      <w:r>
+        <w:rPr>
+          <w:rFonts w:cs="Times New Roman"/>
+        </w:rPr>
+        <w:t>: tên đăng nhập, họ tên, vai trò…</w:t>
+      </w:r>
+    </w:p>
+    <w:p>
+      <w:pPr>
+        <w:pStyle w:val="ListParagraph"/>
+        <w:numPr>
+          <w:ilvl w:val="2"/>
+          <w:numId w:val="7"/>
+        </w:numPr>
+        <w:autoSpaceDE/>
+        <w:autoSpaceDN/>
+        <w:spacing w:after="160"/>
+        <w:rPr>
+          <w:rFonts w:cs="Times New Roman"/>
+        </w:rPr>
+      </w:pPr>
+      <w:r>
+        <w:rPr>
+          <w:rFonts w:cs="Times New Roman"/>
+        </w:rPr>
+        <w:t>t</w:t>
+      </w:r>
+      <w:r>
+        <w:rPr>
+          <w:rFonts w:cs="Times New Roman"/>
+        </w:rPr>
+        <w:t>rình đơn cho phép chọn các chức năng: quản lý thông tin nhà cung cấp trang phục, nhập trang phục từ nhà cung cấp, xem thống kê nhà cung cấp theo doanh chi.</w:t>
+      </w:r>
+    </w:p>
+    <w:p>
+      <w:pPr>
+        <w:pStyle w:val="ListParagraph"/>
+        <w:numPr>
+          <w:ilvl w:val="1"/>
+          <w:numId w:val="7"/>
+        </w:numPr>
+        <w:autoSpaceDE/>
+        <w:autoSpaceDN/>
+        <w:spacing w:after="160"/>
+        <w:rPr>
+          <w:rFonts w:cs="Times New Roman"/>
+        </w:rPr>
+      </w:pPr>
+      <w:r>
+        <w:rPr>
+          <w:rFonts w:cs="Times New Roman"/>
+        </w:rPr>
+        <w:t xml:space="preserve">Quản lý chọn chức năng thống kê nhà cung cấp theo doanh chi </w:t>
+      </w:r>
+      <w:r>
+        <w:rPr>
+          <w:rFonts w:cs="Times New Roman"/>
+        </w:rPr>
+        <w:sym w:font="Wingdings" w:char="F0E0"/>
+      </w:r>
+      <w:r>
+        <w:rPr>
+          <w:rFonts w:cs="Times New Roman"/>
+        </w:rPr>
+        <w:t xml:space="preserve"> giao diện thống kê hiển thị với</w:t>
+      </w:r>
+    </w:p>
+    <w:p>
+      <w:pPr>
+        <w:pStyle w:val="ListParagraph"/>
+        <w:numPr>
+          <w:ilvl w:val="2"/>
+          <w:numId w:val="7"/>
+        </w:numPr>
+        <w:autoSpaceDE/>
+        <w:autoSpaceDN/>
+        <w:spacing w:after="160"/>
+        <w:rPr>
+          <w:rFonts w:cs="Times New Roman"/>
+        </w:rPr>
+      </w:pPr>
+      <w:r>
+        <w:rPr>
+          <w:rFonts w:cs="Times New Roman"/>
+        </w:rPr>
+        <w:t>hai trường chọn ngày tháng.</w:t>
+      </w:r>
+    </w:p>
+    <w:p>
+      <w:pPr>
+        <w:pStyle w:val="ListParagraph"/>
+        <w:numPr>
+          <w:ilvl w:val="2"/>
+          <w:numId w:val="7"/>
+        </w:numPr>
+        <w:autoSpaceDE/>
+        <w:autoSpaceDN/>
+        <w:spacing w:after="160"/>
+        <w:rPr>
+          <w:rFonts w:cs="Times New Roman"/>
+        </w:rPr>
+      </w:pPr>
+      <w:r>
+        <w:rPr>
+          <w:rFonts w:cs="Times New Roman"/>
+        </w:rPr>
+        <w:t>một bảng/danh sách, mỗi hàng/dòng tương ứng với thông tin của một nhà cung cấp: tên nhà cung cấp, doanh chi toàn thời gian.</w:t>
+      </w:r>
+    </w:p>
+    <w:p>
+      <w:pPr>
+        <w:pStyle w:val="ListParagraph"/>
+        <w:numPr>
+          <w:ilvl w:val="2"/>
+          <w:numId w:val="7"/>
+        </w:numPr>
+        <w:autoSpaceDE/>
+        <w:autoSpaceDN/>
+        <w:spacing w:after="160"/>
+        <w:rPr>
+          <w:rFonts w:cs="Times New Roman"/>
+        </w:rPr>
+      </w:pPr>
+      <w:r>
+        <w:rPr>
+          <w:rFonts w:cs="Times New Roman"/>
+        </w:rPr>
+        <w:t>một nút xem thống kê.</w:t>
+      </w:r>
+    </w:p>
+    <w:p>
+      <w:pPr>
+        <w:pStyle w:val="ListParagraph"/>
+        <w:numPr>
+          <w:ilvl w:val="1"/>
+          <w:numId w:val="7"/>
+        </w:numPr>
+        <w:autoSpaceDE/>
+        <w:autoSpaceDN/>
+        <w:spacing w:after="160"/>
+        <w:rPr>
+          <w:rFonts w:cs="Times New Roman"/>
+        </w:rPr>
+      </w:pPr>
+      <w:r>
+        <w:rPr>
+          <w:rFonts w:cs="Times New Roman"/>
+        </w:rPr>
+        <w:t xml:space="preserve">Quản lý điền ngày tháng bắt đầu và kết thúc vào các trường, chọn xem thống kê </w:t>
+      </w:r>
+      <w:r>
+        <w:rPr>
+          <w:rFonts w:cs="Times New Roman"/>
+        </w:rPr>
+        <w:sym w:font="Wingdings" w:char="F0E0"/>
+      </w:r>
+      <w:r>
+        <w:rPr>
+          <w:rFonts w:cs="Times New Roman"/>
+        </w:rPr>
+        <w:t xml:space="preserve"> bảng/danh sách được cập nhật, mỗi dòng tương ứng với thông tin của một nhà cung cấp: tên nhà cung cấp, doanh chi trong khoảng thời gian đã chọn.</w:t>
+      </w:r>
+    </w:p>
+    <w:p>
+      <w:pPr>
+        <w:pStyle w:val="ListParagraph"/>
+        <w:numPr>
+          <w:ilvl w:val="1"/>
+          <w:numId w:val="7"/>
+        </w:numPr>
+        <w:autoSpaceDE/>
+        <w:autoSpaceDN/>
+        <w:spacing w:after="160"/>
+        <w:rPr>
+          <w:rFonts w:cs="Times New Roman"/>
+        </w:rPr>
+      </w:pPr>
+      <w:r>
+        <w:rPr>
+          <w:rFonts w:cs="Times New Roman"/>
+        </w:rPr>
+        <w:t xml:space="preserve">Quản lý chọn một hàng/dòng trong bảng/danh sách </w:t>
+      </w:r>
+      <w:r>
+        <w:rPr>
+          <w:rFonts w:cs="Times New Roman"/>
+        </w:rPr>
+        <w:sym w:font="Wingdings" w:char="F0E0"/>
+      </w:r>
+      <w:r>
+        <w:rPr>
+          <w:rFonts w:cs="Times New Roman"/>
+        </w:rPr>
+        <w:t xml:space="preserve"> giao diện hiển thị doanh chi chi tiết của nhà cung cấp được hiển thị với một bảng/danh sách, mỗi dòng/hàng tương ứng với thông tin của một phiếu nhập hàng: mã phiếu, ngày tạo phiếu, tên mặt hàng, đơn giá, số lượng, thành tiền.</w:t>
+      </w:r>
+    </w:p>
+    <w:p>
+      <w:pPr>
+        <w:autoSpaceDE/>
+        <w:autoSpaceDN/>
+        <w:spacing w:after="160"/>
+        <w:rPr>
+          <w:rFonts w:cs="Times New Roman"/>
+        </w:rPr>
+      </w:pPr>
+    </w:p>
+    <w:p>
+      <w:pPr>
+        <w:pStyle w:val="ListParagraph"/>
+        <w:numPr>
+          <w:ilvl w:val="2"/>
+          <w:numId w:val="6"/>
+        </w:numPr>
+        <w:autoSpaceDE/>
+        <w:autoSpaceDN/>
+        <w:spacing w:after="160"/>
+        <w:rPr>
+          <w:rFonts w:cs="Times New Roman"/>
+          <w:b/>
+          <w:bCs/>
+        </w:rPr>
+      </w:pPr>
+      <w:r>
+        <w:rPr>
+          <w:rFonts w:cs="Times New Roman"/>
+          <w:b/>
+          <w:bCs/>
+        </w:rPr>
+        <w:lastRenderedPageBreak/>
+        <w:t>Thông tin của các đối tượng</w:t>
+      </w:r>
+    </w:p>
+    <w:p>
+      <w:pPr>
+        <w:pStyle w:val="ListParagraph"/>
+        <w:numPr>
+          <w:ilvl w:val="0"/>
+          <w:numId w:val="7"/>
+        </w:numPr>
+        <w:autoSpaceDE/>
+        <w:autoSpaceDN/>
+        <w:spacing w:after="160"/>
+        <w:rPr>
+          <w:rFonts w:cs="Times New Roman"/>
+        </w:rPr>
+      </w:pPr>
+      <w:r>
+        <w:rPr>
+          <w:rFonts w:cs="Times New Roman"/>
+        </w:rPr>
+        <w:t>Nhân viên: tên đăng nhập, mật khẩu, họ tên, vai trò</w:t>
+      </w:r>
+    </w:p>
+    <w:p>
+      <w:pPr>
+        <w:pStyle w:val="ListParagraph"/>
+        <w:numPr>
+          <w:ilvl w:val="0"/>
+          <w:numId w:val="7"/>
+        </w:numPr>
+        <w:autoSpaceDE/>
+        <w:autoSpaceDN/>
+        <w:spacing w:after="160"/>
+        <w:rPr>
+          <w:rFonts w:cs="Times New Roman"/>
+        </w:rPr>
+      </w:pPr>
+      <w:r>
+        <w:rPr>
+          <w:rFonts w:cs="Times New Roman"/>
+        </w:rPr>
+        <w:t xml:space="preserve">Quản lý: </w:t>
+      </w:r>
+      <w:r>
+        <w:rPr>
+          <w:rFonts w:cs="Times New Roman"/>
+        </w:rPr>
+        <w:t>tên đăng nhập, mật khẩu, họ tên, vai trò</w:t>
+      </w:r>
+    </w:p>
+    <w:p>
+      <w:pPr>
+        <w:pStyle w:val="ListParagraph"/>
+        <w:numPr>
+          <w:ilvl w:val="0"/>
+          <w:numId w:val="7"/>
+        </w:numPr>
+        <w:autoSpaceDE/>
+        <w:autoSpaceDN/>
+        <w:spacing w:after="160"/>
+        <w:rPr>
+          <w:rFonts w:cs="Times New Roman"/>
+        </w:rPr>
+      </w:pPr>
+      <w:r>
+        <w:rPr>
+          <w:rFonts w:cs="Times New Roman"/>
+        </w:rPr>
+        <w:t xml:space="preserve">Nhân viên nhập hàng: </w:t>
+      </w:r>
+      <w:r>
+        <w:rPr>
+          <w:rFonts w:cs="Times New Roman"/>
+        </w:rPr>
+        <w:t>tên đăng nhập, mật khẩu, họ tên, vai trò</w:t>
+      </w:r>
+    </w:p>
+    <w:p>
+      <w:pPr>
+        <w:pStyle w:val="ListParagraph"/>
+        <w:numPr>
+          <w:ilvl w:val="0"/>
+          <w:numId w:val="7"/>
+        </w:numPr>
+        <w:autoSpaceDE/>
+        <w:autoSpaceDN/>
+        <w:spacing w:after="160"/>
+        <w:rPr>
+          <w:rFonts w:cs="Times New Roman"/>
+        </w:rPr>
+      </w:pPr>
+      <w:r>
+        <w:rPr>
+          <w:rFonts w:cs="Times New Roman"/>
+        </w:rPr>
+        <w:t>Nhà cung cấp: tên nhà cung cấp, địa chỉ, số điện thoại, email</w:t>
+      </w:r>
+    </w:p>
+    <w:p>
+      <w:pPr>
+        <w:pStyle w:val="ListParagraph"/>
+        <w:numPr>
+          <w:ilvl w:val="0"/>
+          <w:numId w:val="7"/>
+        </w:numPr>
+        <w:autoSpaceDE/>
+        <w:autoSpaceDN/>
+        <w:spacing w:after="160"/>
+        <w:rPr>
+          <w:rFonts w:cs="Times New Roman"/>
+        </w:rPr>
+      </w:pPr>
+      <w:r>
+        <w:rPr>
+          <w:rFonts w:cs="Times New Roman"/>
+        </w:rPr>
+        <w:t>Trang phục: tên trang phục, kích cỡ, màu sắc, giá nhập</w:t>
+      </w:r>
+    </w:p>
+    <w:p>
+      <w:pPr>
+        <w:pStyle w:val="ListParagraph"/>
+        <w:numPr>
+          <w:ilvl w:val="0"/>
+          <w:numId w:val="7"/>
+        </w:numPr>
+        <w:autoSpaceDE/>
+        <w:autoSpaceDN/>
+        <w:spacing w:after="160"/>
+        <w:rPr>
+          <w:rFonts w:cs="Times New Roman"/>
+        </w:rPr>
+      </w:pPr>
+      <w:r>
+        <w:rPr>
+          <w:rFonts w:cs="Times New Roman"/>
+        </w:rPr>
+        <w:t>Phiếu nhập hàng: mã phiếu, ngày tạo phiếu, người tạo, tên mặt hàng, tên nhà cung cấp, đơn giá, số lượng, thành tiền</w:t>
+      </w:r>
+    </w:p>
+    <w:p>
+      <w:pPr>
+        <w:autoSpaceDE/>
+        <w:autoSpaceDN/>
+        <w:spacing w:after="160"/>
+        <w:rPr>
+          <w:rFonts w:cs="Times New Roman"/>
+        </w:rPr>
+      </w:pPr>
+    </w:p>
+    <w:p>
+      <w:pPr>
+        <w:pStyle w:val="ListParagraph"/>
+        <w:numPr>
+          <w:ilvl w:val="2"/>
+          <w:numId w:val="6"/>
+        </w:numPr>
+        <w:autoSpaceDE/>
+        <w:autoSpaceDN/>
+        <w:spacing w:after="160"/>
+        <w:rPr>
+          <w:rFonts w:cs="Times New Roman"/>
+          <w:b/>
+          <w:bCs/>
+        </w:rPr>
+      </w:pPr>
+      <w:r>
+        <w:rPr>
+          <w:rFonts w:cs="Times New Roman"/>
+          <w:b/>
+          <w:bCs/>
+        </w:rPr>
+        <w:t>Quan hệ giữa các đối tượng</w:t>
+      </w:r>
+    </w:p>
+    <w:p>
+      <w:pPr>
+        <w:pStyle w:val="ListParagraph"/>
+        <w:numPr>
+          <w:ilvl w:val="0"/>
+          <w:numId w:val="7"/>
+        </w:numPr>
+        <w:autoSpaceDE/>
+        <w:autoSpaceDN/>
+        <w:spacing w:after="160"/>
+        <w:rPr>
+          <w:rFonts w:cs="Times New Roman"/>
+        </w:rPr>
+      </w:pPr>
+      <w:r>
+        <w:rPr>
+          <w:rFonts w:cs="Times New Roman"/>
+        </w:rPr>
+        <w:t xml:space="preserve">Một quản lý có thể </w:t>
+      </w:r>
+      <w:r>
+        <w:rPr>
+          <w:rFonts w:cs="Times New Roman"/>
+        </w:rPr>
+        <w:t>quản lý</w:t>
+      </w:r>
+      <w:r>
+        <w:rPr>
+          <w:rFonts w:cs="Times New Roman"/>
+        </w:rPr>
+        <w:t xml:space="preserve"> nhiều nhà cung cấp, mỗi nhà cung cấp </w:t>
+      </w:r>
+      <w:r>
+        <w:rPr>
+          <w:rFonts w:cs="Times New Roman"/>
+        </w:rPr>
+        <w:t>có thể được quản lý bởi nhiều</w:t>
+      </w:r>
+      <w:r>
+        <w:rPr>
+          <w:rFonts w:cs="Times New Roman"/>
+        </w:rPr>
+        <w:t xml:space="preserve"> quản lý.</w:t>
+      </w:r>
+    </w:p>
+    <w:p>
+      <w:pPr>
+        <w:pStyle w:val="ListParagraph"/>
+        <w:numPr>
+          <w:ilvl w:val="0"/>
+          <w:numId w:val="7"/>
+        </w:numPr>
+        <w:autoSpaceDE/>
+        <w:autoSpaceDN/>
+        <w:spacing w:after="160"/>
+        <w:rPr>
+          <w:rFonts w:cs="Times New Roman"/>
+        </w:rPr>
+      </w:pPr>
+      <w:r>
+        <w:rPr>
+          <w:rFonts w:cs="Times New Roman"/>
+        </w:rPr>
+        <w:t xml:space="preserve">Mỗi nhà cung cấp có thể </w:t>
+      </w:r>
+      <w:r>
+        <w:rPr>
+          <w:rFonts w:cs="Times New Roman"/>
+        </w:rPr>
+        <w:t>cung cấp</w:t>
+      </w:r>
+      <w:r>
+        <w:rPr>
+          <w:rFonts w:cs="Times New Roman"/>
+        </w:rPr>
+        <w:t xml:space="preserve"> nhiều trang phục, mỗi trang phục chỉ thuộc về một nhà cung cấp.</w:t>
+      </w:r>
+    </w:p>
+    <w:p>
+      <w:pPr>
+        <w:pStyle w:val="ListParagraph"/>
+        <w:numPr>
+          <w:ilvl w:val="0"/>
+          <w:numId w:val="7"/>
+        </w:numPr>
+        <w:autoSpaceDE/>
+        <w:autoSpaceDN/>
+        <w:spacing w:after="160"/>
+        <w:rPr>
+          <w:rFonts w:cs="Times New Roman"/>
+        </w:rPr>
+      </w:pPr>
+      <w:r>
+        <w:rPr>
+          <w:rFonts w:cs="Times New Roman"/>
+        </w:rPr>
+        <w:t>Mỗi nhân viên có thể tạo mới nhiều phiếu nhập hàng, mỗi phiếu nhập hàng chỉ được tạo bởi một nhân viên.</w:t>
+      </w:r>
+    </w:p>
+    <w:p>
+      <w:pPr>
+        <w:pStyle w:val="ListParagraph"/>
+        <w:numPr>
+          <w:ilvl w:val="0"/>
+          <w:numId w:val="7"/>
+        </w:numPr>
+        <w:autoSpaceDE/>
+        <w:autoSpaceDN/>
+        <w:spacing w:after="160"/>
+        <w:rPr>
+          <w:rFonts w:cs="Times New Roman"/>
+        </w:rPr>
+      </w:pPr>
+      <w:r>
+        <w:rPr>
+          <w:rFonts w:cs="Times New Roman"/>
+        </w:rPr>
+        <w:t>Mỗi nhà cung cấp có thể có nhiều phiếu nhập hàng, mỗi phiếu nhập hàng chỉ thuộc về một nhà cung cấp.</w:t>
+      </w:r>
+    </w:p>
+    <w:p>
+      <w:pPr>
+        <w:pStyle w:val="ListParagraph"/>
+        <w:numPr>
+          <w:ilvl w:val="0"/>
+          <w:numId w:val="7"/>
+        </w:numPr>
+        <w:autoSpaceDE/>
+        <w:autoSpaceDN/>
+        <w:spacing w:after="160"/>
+        <w:rPr>
+          <w:rFonts w:cs="Times New Roman"/>
+        </w:rPr>
+      </w:pPr>
+      <w:r>
+        <w:rPr>
+          <w:rFonts w:cs="Times New Roman"/>
+        </w:rPr>
+        <w:t>Mỗi trang phục có thể xuất hiện trong nhiều phiếu nhập hàng, mỗi phiếu nhập hàng chỉ bao gồm một trang phục.</w:t>
+      </w:r>
     </w:p>
     <w:sectPr>
       <w:footerReference w:type="default" r:id="rId9"/>

</xml_diff>